<commit_message>
Update workforce and caregiver learning materials
</commit_message>
<xml_diff>
--- a/Topics/Datacenter-Workforce-Programs/08-Application-Execution/examples/Changsoo Park - Resume - AWA Fiber Technician.docx
+++ b/Topics/Datacenter-Workforce-Programs/08-Application-Execution/examples/Changsoo Park - Resume - AWA Fiber Technician.docx
@@ -27,7 +27,7 @@
           <w:i w:val="0"/>
           <w:sz w:val="20"/>
         </w:rPr>
-        <w:t>Bonney Lake, WA  |  [PHONE]  |  solkit70@gmail.com</w:t>
+        <w:t>Bonney Lake, WA  |  (201) 753-2541  |  solkit70@gmail.com</w:t>
       </w:r>
     </w:p>
     <w:p>
@@ -70,7 +70,7 @@
           <w:i w:val="0"/>
           <w:sz w:val="21"/>
         </w:rPr>
-        <w:t>Twenty years of hands-on technical work — diagnosing, testing, and fixing production systems — now moving deliberately into the skilled trades. Over my career I have relocated for work seven times, living and working in Rhode Island, California, Minnesota, Illinois, Florida, New Jersey, Washington, and South Korea. Traveling to Indianapolis or Columbus for four weeks of training is nothing new for me; it is how I have always worked. I want work I can do with my hands, where the result is something that physically functions — and I intend to stay in it.</w:t>
+        <w:t>Twenty years of hands-on technical problem solving — diagnosing, testing, and fixing production systems — now moving deliberately into the skilled trades. Over my career I have relocated for work seven times, living and working in Rhode Island, California, Minnesota, Illinois, Florida, New Jersey, Washington, and South Korea. Traveling to Indianapolis or Columbus for four weeks of training is nothing new for me; it is how I have always worked. I want work I can do with my hands, where the result is something that physically functions — and I intend to stay in it.</w:t>
       </w:r>
     </w:p>
     <w:p>
@@ -99,7 +99,7 @@
         <w:rPr>
           <w:sz w:val="21"/>
         </w:rPr>
-        <w:t>Proven willingness to relocate — seven work relocations across six U.S. states and two countries over fifteen years. Long on-site assignments, not short trips.</w:t>
+        <w:t>Proven willingness to relocate — seven work relocations across seven U.S. states and two countries over fifteen years. Long on-site assignments, not short trips.</w:t>
       </w:r>
     </w:p>
     <w:p>
@@ -112,7 +112,7 @@
         <w:rPr>
           <w:sz w:val="21"/>
         </w:rPr>
-        <w:t>Diagnostics as a daily habit — a decade of test automation and quality assurance means isolating a fault methodically instead of guessing at it.</w:t>
+        <w:t>Diagnostics as a daily habit — nearly a decade of test automation and quality assurance taught me to isolate faults methodically instead of guessing.</w:t>
       </w:r>
     </w:p>
     <w:p>
@@ -125,7 +125,7 @@
         <w:rPr>
           <w:sz w:val="21"/>
         </w:rPr>
-        <w:t>Still learning after twenty years — seven certifications and courses completed between 2018 and 2022.</w:t>
+        <w:t>Quick to pick up unfamiliar systems — moved from software development to test automation to cloud infrastructure to AI application work, learning each one on the job.</w:t>
       </w:r>
     </w:p>
     <w:p>
@@ -421,7 +421,7 @@
         <w:rPr>
           <w:sz w:val="21"/>
         </w:rPr>
-        <w:t>Relocated to each client site and worked embedded in their teams, adapting to new sites, tools, and crews on short notice.</w:t>
+        <w:t>Relocated to each client site and worked embedded in their teams, adapting to new sites, tools, and work environments on short notice.</w:t>
       </w:r>
     </w:p>
     <w:p>
@@ -573,38 +573,6 @@
         <w:rPr>
           <w:sz w:val="20"/>
         </w:rPr>
-        <w:t>Core Java Specialization — Coursera</w:t>
-        <w:tab/>
-        <w:t>2022</w:t>
-      </w:r>
-    </w:p>
-    <w:p>
-      <w:pPr>
-        <w:tabs>
-          <w:tab w:pos="10224" w:val="right"/>
-        </w:tabs>
-        <w:spacing w:before="0" w:after="0"/>
-      </w:pPr>
-      <w:r>
-        <w:rPr>
-          <w:sz w:val="20"/>
-        </w:rPr>
-        <w:t>Getting Started with Power BI Desktop — Coursera</w:t>
-        <w:tab/>
-        <w:t>2021</w:t>
-      </w:r>
-    </w:p>
-    <w:p>
-      <w:pPr>
-        <w:tabs>
-          <w:tab w:pos="10224" w:val="right"/>
-        </w:tabs>
-        <w:spacing w:before="0" w:after="0"/>
-      </w:pPr>
-      <w:r>
-        <w:rPr>
-          <w:sz w:val="20"/>
-        </w:rPr>
         <w:t>Agile Software Development — Coursera</w:t>
         <w:tab/>
         <w:t>2021</w:t>
@@ -660,38 +628,6 @@
     </w:p>
     <w:p>
       <w:pPr>
-        <w:tabs>
-          <w:tab w:pos="10224" w:val="right"/>
-        </w:tabs>
-        <w:spacing w:before="0" w:after="0"/>
-      </w:pPr>
-      <w:r>
-        <w:rPr>
-          <w:sz w:val="20"/>
-        </w:rPr>
-        <w:t>SAP NetWeaver Development Consultant, ABAP — SAP</w:t>
-        <w:tab/>
-        <w:t>2009</w:t>
-      </w:r>
-    </w:p>
-    <w:p>
-      <w:pPr>
-        <w:tabs>
-          <w:tab w:pos="10224" w:val="right"/>
-        </w:tabs>
-        <w:spacing w:before="0" w:after="0"/>
-      </w:pPr>
-      <w:r>
-        <w:rPr>
-          <w:sz w:val="20"/>
-        </w:rPr>
-        <w:t>Oracle Certified Professional, Oracle 9i DBA — Oracle</w:t>
-        <w:tab/>
-        <w:t>2003</w:t>
-      </w:r>
-    </w:p>
-    <w:p>
-      <w:pPr>
         <w:spacing w:before="200" w:after="60"/>
         <w:pBdr>
           <w:bottom w:val="single" w:sz="6" w:space="1" w:color="999999"/>
@@ -716,7 +652,7 @@
           <w:i w:val="0"/>
           <w:sz w:val="21"/>
         </w:rPr>
-        <w:t>Gangwon National University — South Korea</w:t>
+        <w:t>Gangwon National University — B.A., Political Science  |  South Korea</w:t>
       </w:r>
     </w:p>
     <w:p>
@@ -745,7 +681,7 @@
         <w:rPr>
           <w:sz w:val="21"/>
         </w:rPr>
-        <w:t>Available for full-time training in Indianapolis or Columbus.</w:t>
+        <w:t>Available for full-time training in Indianapolis or Columbus, and for full-time employment on completion.</w:t>
       </w:r>
     </w:p>
     <w:p>
@@ -758,7 +694,20 @@
         <w:rPr>
           <w:sz w:val="21"/>
         </w:rPr>
-        <w:t>Preferred work location: Pacific Northwest (Washington). Willing to relocate elsewhere in the United States if the role requires it.</w:t>
+        <w:t>Open to placement anywhere in the United States, including traveler status.</w:t>
+      </w:r>
+    </w:p>
+    <w:p>
+      <w:pPr>
+        <w:pStyle w:val="ListBullet"/>
+        <w:spacing w:before="0" w:after="20"/>
+        <w:ind w:left="346" w:hanging="202"/>
+      </w:pPr>
+      <w:r>
+        <w:rPr>
+          <w:sz w:val="21"/>
+        </w:rPr>
+        <w:t>Physically active outside of work — regular hiking and mushroom foraging in the mountains, including full days on foot in variable weather.</w:t>
       </w:r>
     </w:p>
     <w:p>

</xml_diff>